<commit_message>
T-061: setel ulang TTD dengan tanda tangan Ketua sungguhan
Diuji di Word pada kedelapan template dengan tanda tangan basah Ketua
Himpunan yang sebenarnya:

- rapikanTtd: latar putih/abu terang -> transparan (scan/foto tanpa
  alpha), tepi tinta dilunakkan, margin kosong dipangkas.
- Ukuran tampil 180x90 px: pada 100 px lengkung atas tanda tangan menimpa
  "Ketua HMIF" di template bertuang sempit.
- Dua tambatan (ttdMelayang): {%ttd} di baris kosong di atas nama,
  {%ttd_nama} di paragraf nama (Keterangan Aktif); dasar gambar selalu
  tepat di atas nama.
- Undangan Pemateri tak lagi punya halaman kedua kosong
  (hapusPindahHalamanAkhir); lampiran Aspirasi tak lagi mencetak butir
  kosong ({#poin} berdiri sendiri). Keduanya dikunci test.

Template 02/03/04-pemateri -> v3, sudah diunggah. Berkas tanda tangan
tidak disimpan di repo maupun DB (data pribadi). ADR-029 diperbarui.

Gate: verify 806, template-dryrun 12/12, upload-templates 13 TETAP.
</commit_message>
<xml_diff>
--- a/templates/surat-03-aspirasi.docx
+++ b/templates/surat-03-aspirasi.docx
@@ -1081,7 +1081,34 @@
           <w:szCs w:val="26"/>
           <w:rtl w:val="0"/>
         </w:rPr>
-        <w:t xml:space="preserve">{#poin}{judul}</w:t>
+        <w:t xml:space="preserve">{#poin}</w:t>
+      </w:r>
+    </w:p>
+    <w:p>
+      <w:pPr>
+        <w:pStyle w:val="Heading3"/>
+        <w:keepNext w:val="0"/>
+        <w:keepLines w:val="0"/>
+        <w:widowControl w:val="1"/>
+        <w:spacing w:line="360" w:lineRule="auto"/>
+        <w:rPr>
+          <w:b w:val="0"/>
+          <w:bCs w:val="0"/>
+          <w:sz w:val="26"/>
+          <w:szCs w:val="26"/>
+        </w:rPr>
+      </w:pPr>
+      <w:bookmarkStart w:colFirst="0" w:colLast="0" w:name="_heading=h.sm8a3qb7hfm6" w:id="0"/>
+      <w:bookmarkEnd w:id="0"/>
+      <w:r>
+        <w:rPr>
+          <w:b w:val="0"/>
+          <w:bCs w:val="0"/>
+          <w:sz w:val="26"/>
+          <w:szCs w:val="26"/>
+          <w:rtl w:val="0"/>
+        </w:rPr>
+        <w:t xml:space="preserve">{judul}</w:t>
       </w:r>
     </w:p>
     <w:p>

</xml_diff>